<commit_message>
Fill Template 6 business model with lean USD 60k revenue plan
Regenerate Sustainow KlimaGuard Kids business model docx: revenue channels, users, GTM, partners, competitors, funding.

Co-authored-by: carbonintelli <carbonintelli@users.noreply.github.com>
</commit_message>
<xml_diff>
--- a/UNGM/submission/06_Business_Model_Plan_Sustainow_KlimaGuardKids.docx
+++ b/UNGM/submission/06_Business_Model_Plan_Sustainow_KlimaGuardKids.docx
@@ -505,7 +505,7 @@
           </w:tcPr>
           <w:p>
             <w:r>
-              <w:t>Implementation / pilot support</w:t>
+              <w:t>Implementation / pilot support (schools, NGOs, CSR-funded pilots)</w:t>
             </w:r>
           </w:p>
         </w:tc>
@@ -537,7 +537,7 @@
           </w:tcPr>
           <w:p>
             <w:r>
-              <w:t>25000</w:t>
+              <w:t>8000</w:t>
             </w:r>
           </w:p>
         </w:tc>
@@ -553,7 +553,7 @@
           </w:tcPr>
           <w:p>
             <w:r>
-              <w:t>40%</w:t>
+              <w:t>50%</w:t>
             </w:r>
           </w:p>
         </w:tc>
@@ -569,7 +569,7 @@
           </w:tcPr>
           <w:p>
             <w:r>
-              <w:t>MoUs before build; fixed-scope SOWs; open demo reduces sales friction</w:t>
+              <w:t>MoUs before delivery; fixed-scope SOWs; facilitator kits; open live demo</w:t>
             </w:r>
           </w:p>
         </w:tc>
@@ -596,7 +596,7 @@
           </w:tcPr>
           <w:p>
             <w:r>
-              <w:t>CSR / ESG community programmes</w:t>
+              <w:t>CSR / ESG community climate-health programmes</w:t>
             </w:r>
           </w:p>
         </w:tc>
@@ -628,7 +628,7 @@
           </w:tcPr>
           <w:p>
             <w:r>
-              <w:t>20000</w:t>
+              <w:t>6000</w:t>
             </w:r>
           </w:p>
         </w:tc>
@@ -644,7 +644,7 @@
           </w:tcPr>
           <w:p>
             <w:r>
-              <w:t>30%</w:t>
+              <w:t>38%</w:t>
             </w:r>
           </w:p>
         </w:tc>
@@ -660,7 +660,7 @@
           </w:tcPr>
           <w:p>
             <w:r>
-              <w:t>Outcome dashboards (CHIS); school packs; brand-safe OSS story</w:t>
+              <w:t>CHIS/outcome dashboards; school packs; brand-safe MIT OSS story; multi-sponsor pipeline</w:t>
             </w:r>
           </w:p>
         </w:tc>
@@ -687,7 +687,7 @@
           </w:tcPr>
           <w:p>
             <w:r>
-              <w:t>Government / UN adaptation contracts</w:t>
+              <w:t>Government / UN adaptation &amp; programme contracts (early pipeline)</w:t>
             </w:r>
           </w:p>
         </w:tc>
@@ -719,7 +719,7 @@
           </w:tcPr>
           <w:p>
             <w:r>
-              <w:t>15000</w:t>
+              <w:t>2000</w:t>
             </w:r>
           </w:p>
         </w:tc>
@@ -735,7 +735,7 @@
           </w:tcPr>
           <w:p>
             <w:r>
-              <w:t>20%</w:t>
+              <w:t>12%</w:t>
             </w:r>
           </w:p>
         </w:tc>
@@ -751,7 +751,7 @@
           </w:tcPr>
           <w:p>
             <w:r>
-              <w:t>In-country deploy playbooks; MIT auditability; VF reference</w:t>
+              <w:t>In-country deploy playbook; MIT auditability; VF reference; start with small paid pilots</w:t>
             </w:r>
           </w:p>
         </w:tc>
@@ -778,7 +778,7 @@
           </w:tcPr>
           <w:p>
             <w:r>
-              <w:t>Potential: API/hosting SLA &amp; training</w:t>
+              <w:t>Potential: API/hosting SLA, training &amp; integration support</w:t>
             </w:r>
           </w:p>
         </w:tc>
@@ -810,7 +810,7 @@
           </w:tcPr>
           <w:p>
             <w:r>
-              <w:t>10000</w:t>
+              <w:t>4000 (upside)</w:t>
             </w:r>
           </w:p>
         </w:tc>
@@ -826,7 +826,7 @@
           </w:tcPr>
           <w:p>
             <w:r>
-              <w:t>10%</w:t>
+              <w:t>n/a (potential)</w:t>
             </w:r>
           </w:p>
         </w:tc>
@@ -842,7 +842,7 @@
           </w:tcPr>
           <w:p>
             <w:r>
-              <w:t>Tiered support menu; start with self-serve OSS</w:t>
+              <w:t>Tiered support menu; self-serve OSS first; paid SLA only after pilot proof</w:t>
             </w:r>
           </w:p>
         </w:tc>
@@ -2478,7 +2478,7 @@
           </w:tcPr>
           <w:p>
             <w:r>
-              <w:t>100000</w:t>
+              <w:t>60000</w:t>
             </w:r>
           </w:p>
         </w:tc>
@@ -2510,7 +2510,7 @@
           </w:tcPr>
           <w:p>
             <w:r>
-              <w:t>CSR pilot contracts</w:t>
+              <w:t>CSR / programme pilot contracts</w:t>
             </w:r>
           </w:p>
         </w:tc>
@@ -2530,7 +2530,7 @@
           </w:tcPr>
           <w:p>
             <w:r>
-              <w:t>30000</w:t>
+              <w:t>6000–10000</w:t>
             </w:r>
           </w:p>
         </w:tc>
@@ -2540,7 +2540,7 @@
           </w:tcPr>
           <w:p>
             <w:r>
-              <w:t>Pilot proposals to corporates/NGOs</w:t>
+              <w:t>Pilot proposals to corporates/NGOs; school packs</w:t>
             </w:r>
           </w:p>
         </w:tc>
@@ -2582,7 +2582,7 @@
           </w:tcPr>
           <w:p>
             <w:r>
-              <w:t>25000</w:t>
+              <w:t>10000–15000</w:t>
             </w:r>
           </w:p>
         </w:tc>

</xml_diff>